<commit_message>
reset commands for cisco devices
</commit_message>
<xml_diff>
--- a/cisco/aaa-ise.docx
+++ b/cisco/aaa-ise.docx
@@ -1170,15 +1170,7 @@
         <w:t>R1 #</w:t>
       </w:r>
       <w:r>
-        <w:t xml:space="preserve">show </w:t>
-      </w:r>
-      <w:proofErr w:type="spellStart"/>
-      <w:r>
-        <w:t>ip</w:t>
-      </w:r>
-      <w:proofErr w:type="spellEnd"/>
-      <w:r>
-        <w:t xml:space="preserve"> auth-proxy cache</w:t>
+        <w:t>show ip auth-proxy cache</w:t>
       </w:r>
     </w:p>
     <w:p>
@@ -1198,13 +1190,8 @@
     </w:p>
     <w:p>
       <w:r>
-        <w:t xml:space="preserve">R1 (config) #aaa </w:t>
-      </w:r>
-      <w:proofErr w:type="gramStart"/>
-      <w:r>
-        <w:t>new-model</w:t>
-      </w:r>
-      <w:proofErr w:type="gramEnd"/>
+        <w:t>R1 (config) #aaa new-model</w:t>
+      </w:r>
     </w:p>
     <w:p>
       <w:pPr>
@@ -1400,14 +1387,12 @@
           <w:numId w:val="1"/>
         </w:numPr>
       </w:pPr>
-      <w:proofErr w:type="spellStart"/>
       <w:r>
         <w:rPr>
           <w:highlight w:val="yellow"/>
         </w:rPr>
         <w:t>ppp</w:t>
       </w:r>
-      <w:proofErr w:type="spellEnd"/>
       <w:r>
         <w:t>: like the service providers</w:t>
       </w:r>
@@ -1811,13 +1796,8 @@
         <w:t>R</w:t>
       </w:r>
       <w:r>
-        <w:t xml:space="preserve">1 (config) #aaa </w:t>
-      </w:r>
-      <w:proofErr w:type="gramStart"/>
-      <w:r>
-        <w:t>new-model</w:t>
-      </w:r>
-      <w:proofErr w:type="gramEnd"/>
+        <w:t>1 (config) #aaa new-model</w:t>
+      </w:r>
     </w:p>
     <w:p>
       <w:pPr>
@@ -1848,9 +1828,11 @@
           <w:sz w:val="20"/>
           <w:szCs w:val="20"/>
         </w:rPr>
-        <w:t>radius-server-</w:t>
-      </w:r>
-      <w:proofErr w:type="spellStart"/>
+        <w:t>radius-server-ip</w:t>
+      </w:r>
+      <w:r>
+        <w:t xml:space="preserve"> key </w:t>
+      </w:r>
       <w:r>
         <w:rPr>
           <w:i/>
@@ -1858,11 +1840,364 @@
           <w:sz w:val="20"/>
           <w:szCs w:val="20"/>
         </w:rPr>
-        <w:t>ip</w:t>
-      </w:r>
-      <w:proofErr w:type="spellEnd"/>
-      <w:r>
-        <w:t xml:space="preserve"> key </w:t>
+        <w:t>shared-key</w:t>
+      </w:r>
+    </w:p>
+    <w:p>
+      <w:pPr>
+        <w:rPr>
+          <w:b/>
+          <w:bCs/>
+        </w:rPr>
+      </w:pPr>
+      <w:r>
+        <w:rPr>
+          <w:b/>
+          <w:bCs/>
+        </w:rPr>
+        <w:t>Protect the console port:</w:t>
+      </w:r>
+    </w:p>
+    <w:p>
+      <w:r>
+        <w:t>R1 (config) #</w:t>
+      </w:r>
+      <w:r>
+        <w:t>u</w:t>
+      </w:r>
+      <w:r>
+        <w:t>sername cisco password cisco</w:t>
+      </w:r>
+    </w:p>
+    <w:p>
+      <w:pPr>
+        <w:rPr>
+          <w:b/>
+          <w:bCs/>
+        </w:rPr>
+      </w:pPr>
+      <w:r>
+        <w:t xml:space="preserve">R1 (config) #aaa authentication </w:t>
+      </w:r>
+      <w:r>
+        <w:rPr>
+          <w:highlight w:val="yellow"/>
+        </w:rPr>
+        <w:t>login</w:t>
+      </w:r>
+      <w:r>
+        <w:t xml:space="preserve"> </w:t>
+      </w:r>
+      <w:r>
+        <w:rPr>
+          <w:highlight w:val="green"/>
+        </w:rPr>
+        <w:t>CONSOLENOAAA</w:t>
+      </w:r>
+      <w:r>
+        <w:t xml:space="preserve"> </w:t>
+      </w:r>
+      <w:r>
+        <w:rPr>
+          <w:highlight w:val="cyan"/>
+        </w:rPr>
+        <w:t>local</w:t>
+      </w:r>
+      <w:r>
+        <w:t xml:space="preserve"> </w:t>
+      </w:r>
+      <w:r>
+        <w:rPr>
+          <w:b/>
+          <w:bCs/>
+        </w:rPr>
+        <w:t>(W</w:t>
+      </w:r>
+      <w:r>
+        <w:rPr>
+          <w:b/>
+          <w:bCs/>
+        </w:rPr>
+        <w:t>arning!</w:t>
+      </w:r>
+      <w:r>
+        <w:rPr>
+          <w:b/>
+          <w:bCs/>
+        </w:rPr>
+        <w:t xml:space="preserve"> </w:t>
+      </w:r>
+      <w:r>
+        <w:rPr>
+          <w:b/>
+          <w:bCs/>
+        </w:rPr>
+        <w:t>Create user before)</w:t>
+      </w:r>
+    </w:p>
+    <w:p>
+      <w:r>
+        <w:t xml:space="preserve">R1 (config) #aaa authorization </w:t>
+      </w:r>
+      <w:r>
+        <w:rPr>
+          <w:highlight w:val="yellow"/>
+        </w:rPr>
+        <w:t>exec</w:t>
+      </w:r>
+      <w:r>
+        <w:t xml:space="preserve"> </w:t>
+      </w:r>
+      <w:r>
+        <w:rPr>
+          <w:highlight w:val="green"/>
+        </w:rPr>
+        <w:t>IWANTPRIV15</w:t>
+      </w:r>
+      <w:r>
+        <w:t xml:space="preserve"> </w:t>
+      </w:r>
+      <w:r>
+        <w:rPr>
+          <w:highlight w:val="cyan"/>
+        </w:rPr>
+        <w:t>none</w:t>
+      </w:r>
+    </w:p>
+    <w:p>
+      <w:r>
+        <w:t>R1 (config) #line console 0</w:t>
+      </w:r>
+    </w:p>
+    <w:p>
+      <w:r>
+        <w:t>R1 (config-line) #login authentication CONSOLENOAAA</w:t>
+      </w:r>
+    </w:p>
+    <w:p>
+      <w:r>
+        <w:t>R1 (config-line) #authorization exec IWANTPRIV15</w:t>
+      </w:r>
+    </w:p>
+    <w:p>
+      <w:pPr>
+        <w:rPr>
+          <w:b/>
+          <w:bCs/>
+        </w:rPr>
+      </w:pPr>
+      <w:r>
+        <w:rPr>
+          <w:b/>
+          <w:bCs/>
+        </w:rPr>
+        <w:t>Others with the RADIUS server:</w:t>
+      </w:r>
+    </w:p>
+    <w:p>
+      <w:r>
+        <w:t xml:space="preserve">R1 (config) #aaa authentication </w:t>
+      </w:r>
+      <w:r>
+        <w:rPr>
+          <w:highlight w:val="yellow"/>
+        </w:rPr>
+        <w:t>login</w:t>
+      </w:r>
+      <w:r>
+        <w:t xml:space="preserve"> </w:t>
+      </w:r>
+      <w:r>
+        <w:rPr>
+          <w:highlight w:val="green"/>
+        </w:rPr>
+        <w:t>default</w:t>
+      </w:r>
+      <w:r>
+        <w:t xml:space="preserve"> </w:t>
+      </w:r>
+      <w:r>
+        <w:rPr>
+          <w:highlight w:val="cyan"/>
+        </w:rPr>
+        <w:t>group radius</w:t>
+      </w:r>
+    </w:p>
+    <w:p>
+      <w:r>
+        <w:t xml:space="preserve">R1 (config) #aaa authorization </w:t>
+      </w:r>
+      <w:r>
+        <w:rPr>
+          <w:highlight w:val="yellow"/>
+        </w:rPr>
+        <w:t>exec</w:t>
+      </w:r>
+      <w:r>
+        <w:t xml:space="preserve"> </w:t>
+      </w:r>
+      <w:r>
+        <w:rPr>
+          <w:highlight w:val="green"/>
+        </w:rPr>
+        <w:t>default</w:t>
+      </w:r>
+      <w:r>
+        <w:t xml:space="preserve"> </w:t>
+      </w:r>
+      <w:r>
+        <w:rPr>
+          <w:highlight w:val="cyan"/>
+        </w:rPr>
+        <w:t>group radius</w:t>
+      </w:r>
+    </w:p>
+    <w:p>
+      <w:pPr>
+        <w:rPr>
+          <w:b/>
+          <w:bCs/>
+        </w:rPr>
+      </w:pPr>
+      <w:r>
+        <w:rPr>
+          <w:b/>
+          <w:bCs/>
+        </w:rPr>
+        <w:t>Configure SSH:</w:t>
+      </w:r>
+    </w:p>
+    <w:p>
+      <w:r>
+        <w:t>R1(config)</w:t>
+      </w:r>
+      <w:r>
+        <w:t xml:space="preserve"> #</w:t>
+      </w:r>
+      <w:r>
+        <w:t xml:space="preserve">ip domain-name </w:t>
+      </w:r>
+      <w:r>
+        <w:t>test.lan</w:t>
+      </w:r>
+    </w:p>
+    <w:p>
+      <w:r>
+        <w:t>R1 (config) #</w:t>
+      </w:r>
+      <w:r>
+        <w:t>crypto key generate rsa modulus 2048</w:t>
+      </w:r>
+    </w:p>
+    <w:p>
+      <w:r>
+        <w:t>R1 (config) #line vty 0 4</w:t>
+      </w:r>
+    </w:p>
+    <w:p>
+      <w:r>
+        <w:t>R1 (config-line) #transport input ssh</w:t>
+      </w:r>
+    </w:p>
+    <w:p>
+      <w:r>
+        <w:t>R1</w:t>
+      </w:r>
+      <w:r>
+        <w:t xml:space="preserve"> </w:t>
+      </w:r>
+      <w:r>
+        <w:t>(config-line)</w:t>
+      </w:r>
+      <w:r>
+        <w:t xml:space="preserve"> </w:t>
+      </w:r>
+      <w:r>
+        <w:t>#login authentication default</w:t>
+      </w:r>
+    </w:p>
+    <w:p>
+      <w:r>
+        <w:t>R1 (config-line) #authorization exec default</w:t>
+      </w:r>
+    </w:p>
+    <w:p>
+      <w:pPr>
+        <w:rPr>
+          <w:rFonts w:asciiTheme="majorHAnsi" w:eastAsiaTheme="majorEastAsia" w:hAnsiTheme="majorHAnsi" w:cstheme="majorBidi"/>
+          <w:color w:val="0F4761" w:themeColor="accent1" w:themeShade="BF"/>
+          <w:sz w:val="32"/>
+          <w:szCs w:val="32"/>
+        </w:rPr>
+      </w:pPr>
+      <w:r>
+        <w:br w:type="page"/>
+      </w:r>
+    </w:p>
+    <w:p>
+      <w:pPr>
+        <w:pStyle w:val="Titre2"/>
+      </w:pPr>
+      <w:bookmarkStart w:id="5" w:name="_Toc224829099"/>
+      <w:r>
+        <w:lastRenderedPageBreak/>
+        <w:t>A</w:t>
+      </w:r>
+      <w:r>
+        <w:t>uth</w:t>
+      </w:r>
+      <w:r>
+        <w:t xml:space="preserve">entication </w:t>
+      </w:r>
+      <w:r>
+        <w:t>proxy access</w:t>
+      </w:r>
+      <w:bookmarkEnd w:id="5"/>
+    </w:p>
+    <w:p>
+      <w:pPr>
+        <w:rPr>
+          <w:b/>
+          <w:bCs/>
+        </w:rPr>
+      </w:pPr>
+      <w:r>
+        <w:rPr>
+          <w:b/>
+          <w:bCs/>
+        </w:rPr>
+        <w:t>Enable AAA on the router:</w:t>
+      </w:r>
+    </w:p>
+    <w:p>
+      <w:r>
+        <w:t>R</w:t>
+      </w:r>
+      <w:r>
+        <w:t>1 (config) #aaa new-model</w:t>
+      </w:r>
+    </w:p>
+    <w:p>
+      <w:pPr>
+        <w:rPr>
+          <w:b/>
+          <w:bCs/>
+        </w:rPr>
+      </w:pPr>
+      <w:r>
+        <w:rPr>
+          <w:b/>
+          <w:bCs/>
+        </w:rPr>
+        <w:t>Specify the RADIUS server:</w:t>
+      </w:r>
+    </w:p>
+    <w:p>
+      <w:r>
+        <w:t>R</w:t>
+      </w:r>
+      <w:r>
+        <w:t xml:space="preserve">1 (config) #radius-server host </w:t>
       </w:r>
       <w:r>
         <w:rPr>
@@ -1871,311 +2206,10 @@
           <w:sz w:val="20"/>
           <w:szCs w:val="20"/>
         </w:rPr>
-        <w:t>shared-key</w:t>
-      </w:r>
-    </w:p>
-    <w:p>
-      <w:pPr>
-        <w:rPr>
-          <w:b/>
-          <w:bCs/>
-        </w:rPr>
-      </w:pPr>
-      <w:r>
-        <w:rPr>
-          <w:b/>
-          <w:bCs/>
-        </w:rPr>
-        <w:t>Protect the console port:</w:t>
-      </w:r>
-    </w:p>
-    <w:p>
-      <w:r>
-        <w:t>R1 (config) #</w:t>
-      </w:r>
-      <w:r>
-        <w:t>u</w:t>
-      </w:r>
-      <w:r>
-        <w:t>sername cisco password cisco</w:t>
-      </w:r>
-    </w:p>
-    <w:p>
-      <w:pPr>
-        <w:rPr>
-          <w:b/>
-          <w:bCs/>
-        </w:rPr>
-      </w:pPr>
-      <w:r>
-        <w:t xml:space="preserve">R1 (config) #aaa authentication </w:t>
-      </w:r>
-      <w:r>
-        <w:rPr>
-          <w:highlight w:val="yellow"/>
-        </w:rPr>
-        <w:t>login</w:t>
-      </w:r>
-      <w:r>
-        <w:t xml:space="preserve"> </w:t>
-      </w:r>
-      <w:r>
-        <w:rPr>
-          <w:highlight w:val="green"/>
-        </w:rPr>
-        <w:t>CONSOLENOAAA</w:t>
-      </w:r>
-      <w:r>
-        <w:t xml:space="preserve"> </w:t>
-      </w:r>
-      <w:r>
-        <w:rPr>
-          <w:highlight w:val="cyan"/>
-        </w:rPr>
-        <w:t>local</w:t>
-      </w:r>
-      <w:r>
-        <w:t xml:space="preserve"> (</w:t>
-      </w:r>
-      <w:r>
-        <w:rPr>
-          <w:b/>
-          <w:bCs/>
-        </w:rPr>
-        <w:t>Warning!</w:t>
-      </w:r>
-      <w:r>
-        <w:rPr>
-          <w:b/>
-          <w:bCs/>
-        </w:rPr>
-        <w:t xml:space="preserve"> </w:t>
-      </w:r>
-      <w:r>
-        <w:rPr>
-          <w:b/>
-          <w:bCs/>
-        </w:rPr>
-        <w:t>Create user before)</w:t>
-      </w:r>
-    </w:p>
-    <w:p>
-      <w:r>
-        <w:t xml:space="preserve">R1 (config) #aaa authorization </w:t>
-      </w:r>
-      <w:r>
-        <w:rPr>
-          <w:highlight w:val="yellow"/>
-        </w:rPr>
-        <w:t>exec</w:t>
-      </w:r>
-      <w:r>
-        <w:t xml:space="preserve"> </w:t>
-      </w:r>
-      <w:r>
-        <w:rPr>
-          <w:highlight w:val="green"/>
-        </w:rPr>
-        <w:t>IWANTPRIV15</w:t>
-      </w:r>
-      <w:r>
-        <w:t xml:space="preserve"> </w:t>
-      </w:r>
-      <w:r>
-        <w:rPr>
-          <w:highlight w:val="cyan"/>
-        </w:rPr>
-        <w:t>none</w:t>
-      </w:r>
-    </w:p>
-    <w:p>
-      <w:r>
-        <w:t>R1 (config) #line console 0</w:t>
-      </w:r>
-    </w:p>
-    <w:p>
-      <w:r>
-        <w:t>R1 (config-line) #login authentication CONSOLENOAAA</w:t>
-      </w:r>
-    </w:p>
-    <w:p>
-      <w:r>
-        <w:t>R1 (config-line) #authorization exec IWANTPRIV15</w:t>
-      </w:r>
-    </w:p>
-    <w:p>
-      <w:pPr>
-        <w:rPr>
-          <w:b/>
-          <w:bCs/>
-        </w:rPr>
-      </w:pPr>
-      <w:r>
-        <w:rPr>
-          <w:b/>
-          <w:bCs/>
-        </w:rPr>
-        <w:t>Others with the RADIUS server:</w:t>
-      </w:r>
-    </w:p>
-    <w:p>
-      <w:r>
-        <w:t xml:space="preserve">R1 (config) #aaa authentication </w:t>
-      </w:r>
-      <w:r>
-        <w:rPr>
-          <w:highlight w:val="yellow"/>
-        </w:rPr>
-        <w:t>login</w:t>
-      </w:r>
-      <w:r>
-        <w:t xml:space="preserve"> </w:t>
-      </w:r>
-      <w:r>
-        <w:rPr>
-          <w:highlight w:val="green"/>
-        </w:rPr>
-        <w:t>default</w:t>
-      </w:r>
-      <w:r>
-        <w:t xml:space="preserve"> </w:t>
-      </w:r>
-      <w:r>
-        <w:rPr>
-          <w:highlight w:val="cyan"/>
-        </w:rPr>
-        <w:t>group radius</w:t>
-      </w:r>
-    </w:p>
-    <w:p>
-      <w:r>
-        <w:t xml:space="preserve">R1 (config) #aaa authorization </w:t>
-      </w:r>
-      <w:r>
-        <w:rPr>
-          <w:highlight w:val="yellow"/>
-        </w:rPr>
-        <w:t>exec</w:t>
-      </w:r>
-      <w:r>
-        <w:t xml:space="preserve"> </w:t>
-      </w:r>
-      <w:r>
-        <w:rPr>
-          <w:highlight w:val="green"/>
-        </w:rPr>
-        <w:t>default</w:t>
-      </w:r>
-      <w:r>
-        <w:t xml:space="preserve"> </w:t>
-      </w:r>
-      <w:r>
-        <w:rPr>
-          <w:highlight w:val="cyan"/>
-        </w:rPr>
-        <w:t>group radius</w:t>
-      </w:r>
-    </w:p>
-    <w:p>
-      <w:r>
-        <w:t xml:space="preserve">R1 (config) #line </w:t>
-      </w:r>
-      <w:proofErr w:type="spellStart"/>
-      <w:r>
-        <w:t>vty</w:t>
-      </w:r>
-      <w:proofErr w:type="spellEnd"/>
-      <w:r>
-        <w:t xml:space="preserve"> 0 4</w:t>
-      </w:r>
-    </w:p>
-    <w:p>
-      <w:r>
-        <w:t>R1 (config-line) #authorization exec default</w:t>
-      </w:r>
-    </w:p>
-    <w:p>
-      <w:pPr>
-        <w:rPr>
-          <w:rFonts w:asciiTheme="majorHAnsi" w:eastAsiaTheme="majorEastAsia" w:hAnsiTheme="majorHAnsi" w:cstheme="majorBidi"/>
-          <w:color w:val="0F4761" w:themeColor="accent1" w:themeShade="BF"/>
-          <w:sz w:val="32"/>
-          <w:szCs w:val="32"/>
-        </w:rPr>
-      </w:pPr>
-      <w:r>
-        <w:br w:type="page"/>
-      </w:r>
-    </w:p>
-    <w:p>
-      <w:pPr>
-        <w:pStyle w:val="Titre2"/>
-      </w:pPr>
-      <w:bookmarkStart w:id="5" w:name="_Toc224829099"/>
-      <w:r>
-        <w:lastRenderedPageBreak/>
-        <w:t>A</w:t>
-      </w:r>
-      <w:r>
-        <w:t>uth</w:t>
-      </w:r>
-      <w:r>
-        <w:t xml:space="preserve">entication </w:t>
-      </w:r>
-      <w:r>
-        <w:t>proxy access</w:t>
-      </w:r>
-      <w:bookmarkEnd w:id="5"/>
-    </w:p>
-    <w:p>
-      <w:pPr>
-        <w:rPr>
-          <w:b/>
-          <w:bCs/>
-        </w:rPr>
-      </w:pPr>
-      <w:r>
-        <w:rPr>
-          <w:b/>
-          <w:bCs/>
-        </w:rPr>
-        <w:t>Enable AAA on the router:</w:t>
-      </w:r>
-    </w:p>
-    <w:p>
-      <w:r>
-        <w:t>R</w:t>
-      </w:r>
-      <w:r>
-        <w:t xml:space="preserve">1 (config) #aaa </w:t>
-      </w:r>
-      <w:proofErr w:type="gramStart"/>
-      <w:r>
-        <w:t>new-model</w:t>
-      </w:r>
-      <w:proofErr w:type="gramEnd"/>
-    </w:p>
-    <w:p>
-      <w:pPr>
-        <w:rPr>
-          <w:b/>
-          <w:bCs/>
-        </w:rPr>
-      </w:pPr>
-      <w:r>
-        <w:rPr>
-          <w:b/>
-          <w:bCs/>
-        </w:rPr>
-        <w:t>Specify the RADIUS server:</w:t>
-      </w:r>
-    </w:p>
-    <w:p>
-      <w:r>
-        <w:t>R</w:t>
-      </w:r>
-      <w:r>
-        <w:t xml:space="preserve">1 (config) #radius-server host </w:t>
+        <w:t>radius-server-ip</w:t>
+      </w:r>
+      <w:r>
+        <w:t xml:space="preserve"> key </w:t>
       </w:r>
       <w:r>
         <w:rPr>
@@ -2184,9 +2218,401 @@
           <w:sz w:val="20"/>
           <w:szCs w:val="20"/>
         </w:rPr>
-        <w:t>radius-server-</w:t>
-      </w:r>
-      <w:proofErr w:type="spellStart"/>
+        <w:t>shared-key</w:t>
+      </w:r>
+    </w:p>
+    <w:p>
+      <w:pPr>
+        <w:rPr>
+          <w:b/>
+          <w:bCs/>
+        </w:rPr>
+      </w:pPr>
+      <w:r>
+        <w:rPr>
+          <w:b/>
+          <w:bCs/>
+        </w:rPr>
+        <w:t>Protect the console port:</w:t>
+      </w:r>
+    </w:p>
+    <w:p>
+      <w:pPr>
+        <w:rPr>
+          <w:b/>
+          <w:bCs/>
+          <w:sz w:val="12"/>
+          <w:szCs w:val="12"/>
+        </w:rPr>
+      </w:pPr>
+      <w:r>
+        <w:t xml:space="preserve">R1 (config) #aaa authentication </w:t>
+      </w:r>
+      <w:r>
+        <w:rPr>
+          <w:highlight w:val="yellow"/>
+        </w:rPr>
+        <w:t>login</w:t>
+      </w:r>
+      <w:r>
+        <w:t xml:space="preserve"> </w:t>
+      </w:r>
+      <w:r>
+        <w:rPr>
+          <w:highlight w:val="green"/>
+        </w:rPr>
+        <w:t>CONSOLENOAAA</w:t>
+      </w:r>
+      <w:r>
+        <w:t xml:space="preserve"> </w:t>
+      </w:r>
+      <w:r>
+        <w:rPr>
+          <w:highlight w:val="cyan"/>
+        </w:rPr>
+        <w:t>local</w:t>
+      </w:r>
+      <w:r>
+        <w:t xml:space="preserve"> (</w:t>
+      </w:r>
+      <w:r>
+        <w:rPr>
+          <w:b/>
+          <w:bCs/>
+        </w:rPr>
+        <w:t>Warning! Create user before)</w:t>
+      </w:r>
+    </w:p>
+    <w:p>
+      <w:r>
+        <w:t>R1 (config) #line console 0</w:t>
+      </w:r>
+    </w:p>
+    <w:p>
+      <w:r>
+        <w:t>R1 (config-line) #login authentication CONSOLENOAAA</w:t>
+      </w:r>
+    </w:p>
+    <w:p>
+      <w:pPr>
+        <w:rPr>
+          <w:b/>
+          <w:bCs/>
+        </w:rPr>
+      </w:pPr>
+      <w:r>
+        <w:rPr>
+          <w:b/>
+          <w:bCs/>
+        </w:rPr>
+        <w:t>Change authorization of the console port:</w:t>
+      </w:r>
+    </w:p>
+    <w:p>
+      <w:r>
+        <w:t xml:space="preserve">R1 (config) #aaa authorization </w:t>
+      </w:r>
+      <w:r>
+        <w:rPr>
+          <w:highlight w:val="yellow"/>
+        </w:rPr>
+        <w:t>exec</w:t>
+      </w:r>
+      <w:r>
+        <w:t xml:space="preserve"> </w:t>
+      </w:r>
+      <w:r>
+        <w:rPr>
+          <w:highlight w:val="green"/>
+        </w:rPr>
+        <w:t>IWANTPRIV15</w:t>
+      </w:r>
+      <w:r>
+        <w:t xml:space="preserve"> </w:t>
+      </w:r>
+      <w:r>
+        <w:rPr>
+          <w:highlight w:val="cyan"/>
+        </w:rPr>
+        <w:t>none</w:t>
+      </w:r>
+    </w:p>
+    <w:p>
+      <w:r>
+        <w:t>R1 (config) #line console 0</w:t>
+      </w:r>
+    </w:p>
+    <w:p>
+      <w:r>
+        <w:t>R1 (config-line) #authorization exec IWANTPRIV15</w:t>
+      </w:r>
+    </w:p>
+    <w:p>
+      <w:pPr>
+        <w:rPr>
+          <w:b/>
+          <w:bCs/>
+        </w:rPr>
+      </w:pPr>
+      <w:r>
+        <w:rPr>
+          <w:b/>
+          <w:bCs/>
+        </w:rPr>
+        <w:t>Refer RADIUS for authentication &amp; authorization:</w:t>
+      </w:r>
+    </w:p>
+    <w:p>
+      <w:r>
+        <w:t>R1 (config) #</w:t>
+      </w:r>
+      <w:r>
+        <w:t xml:space="preserve">aaa authentication </w:t>
+      </w:r>
+      <w:r>
+        <w:rPr>
+          <w:highlight w:val="yellow"/>
+        </w:rPr>
+        <w:t>login</w:t>
+      </w:r>
+      <w:r>
+        <w:t xml:space="preserve"> </w:t>
+      </w:r>
+      <w:r>
+        <w:rPr>
+          <w:highlight w:val="green"/>
+        </w:rPr>
+        <w:t>default</w:t>
+      </w:r>
+      <w:r>
+        <w:t xml:space="preserve"> </w:t>
+      </w:r>
+      <w:r>
+        <w:rPr>
+          <w:highlight w:val="cyan"/>
+        </w:rPr>
+        <w:t>group radius</w:t>
+      </w:r>
+      <w:r>
+        <w:br/>
+      </w:r>
+      <w:r>
+        <w:t>R1 (config) #</w:t>
+      </w:r>
+      <w:r>
+        <w:t xml:space="preserve">aaa authorization </w:t>
+      </w:r>
+      <w:r>
+        <w:rPr>
+          <w:highlight w:val="yellow"/>
+        </w:rPr>
+        <w:t>auth-proxy</w:t>
+      </w:r>
+      <w:r>
+        <w:t xml:space="preserve"> </w:t>
+      </w:r>
+      <w:r>
+        <w:rPr>
+          <w:highlight w:val="green"/>
+        </w:rPr>
+        <w:t>default</w:t>
+      </w:r>
+      <w:r>
+        <w:t xml:space="preserve"> </w:t>
+      </w:r>
+      <w:r>
+        <w:rPr>
+          <w:highlight w:val="cyan"/>
+        </w:rPr>
+        <w:t>group radius</w:t>
+      </w:r>
+    </w:p>
+    <w:p>
+      <w:pPr>
+        <w:rPr>
+          <w:b/>
+          <w:bCs/>
+        </w:rPr>
+      </w:pPr>
+      <w:r>
+        <w:rPr>
+          <w:b/>
+          <w:bCs/>
+        </w:rPr>
+        <w:t>Enable the web server on the router:</w:t>
+      </w:r>
+    </w:p>
+    <w:p>
+      <w:r>
+        <w:t>R1 (config) #ip http server</w:t>
+      </w:r>
+    </w:p>
+    <w:p>
+      <w:pPr>
+        <w:rPr>
+          <w:b/>
+          <w:bCs/>
+        </w:rPr>
+      </w:pPr>
+      <w:r>
+        <w:rPr>
+          <w:b/>
+          <w:bCs/>
+        </w:rPr>
+        <w:t>Enable AAA for the web server:</w:t>
+      </w:r>
+    </w:p>
+    <w:p>
+      <w:r>
+        <w:t>R1 (config) #ip http authentication aaa</w:t>
+      </w:r>
+    </w:p>
+    <w:p>
+      <w:pPr>
+        <w:rPr>
+          <w:b/>
+          <w:bCs/>
+        </w:rPr>
+      </w:pPr>
+      <w:r>
+        <w:rPr>
+          <w:b/>
+          <w:bCs/>
+        </w:rPr>
+        <w:t>Create ACL to permit the user access the web server:</w:t>
+      </w:r>
+    </w:p>
+    <w:p>
+      <w:r>
+        <w:t>R1 (config) #access-list 100 permit tcp 192.168.1.0 0.0.0.255 host 192.168.</w:t>
+      </w:r>
+      <w:r>
+        <w:t>1</w:t>
+      </w:r>
+      <w:r>
+        <w:t>.</w:t>
+      </w:r>
+      <w:r>
+        <w:t>254</w:t>
+      </w:r>
+      <w:r>
+        <w:t xml:space="preserve"> eq 80</w:t>
+      </w:r>
+    </w:p>
+    <w:p>
+      <w:r>
+        <w:t>R1 (config) #</w:t>
+      </w:r>
+      <w:r>
+        <w:t>access-list 100 deny ip 192.168.1.0 0.0.0.255 any</w:t>
+      </w:r>
+    </w:p>
+    <w:p>
+      <w:pPr>
+        <w:rPr>
+          <w:b/>
+          <w:bCs/>
+        </w:rPr>
+      </w:pPr>
+      <w:r>
+        <w:rPr>
+          <w:b/>
+          <w:bCs/>
+        </w:rPr>
+        <w:t>Configure the proxy:</w:t>
+      </w:r>
+    </w:p>
+    <w:p>
+      <w:r>
+        <w:t>R1 (config) #ip auth-proxy name HTTPPROXY http list 100</w:t>
+      </w:r>
+    </w:p>
+    <w:p>
+      <w:pPr>
+        <w:rPr>
+          <w:b/>
+          <w:bCs/>
+        </w:rPr>
+      </w:pPr>
+      <w:r>
+        <w:rPr>
+          <w:b/>
+          <w:bCs/>
+        </w:rPr>
+        <w:t>Apply the proxy and the ACL on the interface facing the user:</w:t>
+      </w:r>
+    </w:p>
+    <w:p>
+      <w:r>
+        <w:t>R1 (config) #int g0/0/0</w:t>
+      </w:r>
+    </w:p>
+    <w:p>
+      <w:r>
+        <w:t>R1 (config-if) #ip auth-proxy HTTPPROXY</w:t>
+      </w:r>
+    </w:p>
+    <w:p>
+      <w:r>
+        <w:t>R1 (config-if) #ip access-group 100</w:t>
+      </w:r>
+      <w:r>
+        <w:t xml:space="preserve"> in</w:t>
+      </w:r>
+    </w:p>
+    <w:p>
+      <w:r>
+        <w:br w:type="page"/>
+      </w:r>
+    </w:p>
+    <w:p>
+      <w:pPr>
+        <w:pStyle w:val="Titre1"/>
+      </w:pPr>
+      <w:bookmarkStart w:id="6" w:name="_Toc224829100"/>
+      <w:r>
+        <w:lastRenderedPageBreak/>
+        <w:t xml:space="preserve">802.1X Ethernet </w:t>
+      </w:r>
+      <w:r>
+        <w:t>access</w:t>
+      </w:r>
+      <w:bookmarkEnd w:id="6"/>
+    </w:p>
+    <w:p>
+      <w:pPr>
+        <w:pStyle w:val="Titre2"/>
+      </w:pPr>
+      <w:bookmarkStart w:id="7" w:name="_Toc224829101"/>
+      <w:r>
+        <w:t>On the authenticator device</w:t>
+      </w:r>
+      <w:bookmarkEnd w:id="7"/>
+    </w:p>
+    <w:p>
+      <w:pPr>
+        <w:rPr>
+          <w:b/>
+          <w:bCs/>
+        </w:rPr>
+      </w:pPr>
+      <w:r>
+        <w:rPr>
+          <w:b/>
+          <w:bCs/>
+        </w:rPr>
+        <w:t>On the authenticator switch, configure AAA:</w:t>
+      </w:r>
+    </w:p>
+    <w:p>
+      <w:r>
+        <w:t>SW1 (config) #aaa new-model</w:t>
+      </w:r>
+    </w:p>
+    <w:p>
+      <w:r>
+        <w:t xml:space="preserve">SW1 (config) #radius-server host </w:t>
+      </w:r>
       <w:r>
         <w:rPr>
           <w:i/>
@@ -2194,9 +2620,8 @@
           <w:sz w:val="20"/>
           <w:szCs w:val="20"/>
         </w:rPr>
-        <w:t>ip</w:t>
-      </w:r>
-      <w:proofErr w:type="spellEnd"/>
+        <w:t>radius-server-ip</w:t>
+      </w:r>
       <w:r>
         <w:t xml:space="preserve"> key </w:t>
       </w:r>
@@ -2211,37 +2636,14 @@
       </w:r>
     </w:p>
     <w:p>
-      <w:pPr>
-        <w:rPr>
-          <w:b/>
-          <w:bCs/>
-        </w:rPr>
-      </w:pPr>
-      <w:r>
-        <w:rPr>
-          <w:b/>
-          <w:bCs/>
-        </w:rPr>
-        <w:t>Protect the console port:</w:t>
-      </w:r>
-    </w:p>
-    <w:p>
-      <w:pPr>
-        <w:rPr>
-          <w:b/>
-          <w:bCs/>
-          <w:sz w:val="12"/>
-          <w:szCs w:val="12"/>
-        </w:rPr>
-      </w:pPr>
-      <w:r>
-        <w:t xml:space="preserve">R1 (config) #aaa authentication </w:t>
+      <w:r>
+        <w:t xml:space="preserve">SW1 (config) #aaa authentication </w:t>
       </w:r>
       <w:r>
         <w:rPr>
           <w:highlight w:val="yellow"/>
         </w:rPr>
-        <w:t>login</w:t>
+        <w:t>dot1x</w:t>
       </w:r>
       <w:r>
         <w:t xml:space="preserve"> </w:t>
@@ -2250,7 +2652,7 @@
         <w:rPr>
           <w:highlight w:val="green"/>
         </w:rPr>
-        <w:t>CONSOLENOAAA</w:t>
+        <w:t>default</w:t>
       </w:r>
       <w:r>
         <w:t xml:space="preserve"> </w:t>
@@ -2259,53 +2661,18 @@
         <w:rPr>
           <w:highlight w:val="cyan"/>
         </w:rPr>
-        <w:t>local</w:t>
-      </w:r>
-      <w:r>
-        <w:t xml:space="preserve"> (</w:t>
-      </w:r>
-      <w:r>
-        <w:rPr>
-          <w:b/>
-          <w:bCs/>
-        </w:rPr>
-        <w:t>Warning! Create user before)</w:t>
-      </w:r>
-    </w:p>
-    <w:p>
-      <w:r>
-        <w:t>R1 (config) #line console 0</w:t>
-      </w:r>
-    </w:p>
-    <w:p>
-      <w:r>
-        <w:t>R1 (config-line) #login authentication CONSOLENOAAA</w:t>
-      </w:r>
-    </w:p>
-    <w:p>
-      <w:pPr>
-        <w:rPr>
-          <w:b/>
-          <w:bCs/>
-        </w:rPr>
-      </w:pPr>
-      <w:r>
-        <w:rPr>
-          <w:b/>
-          <w:bCs/>
-        </w:rPr>
-        <w:t>Change authorization of the console port:</w:t>
-      </w:r>
-    </w:p>
-    <w:p>
-      <w:r>
-        <w:t xml:space="preserve">R1 (config) #aaa authorization </w:t>
+        <w:t>group radius</w:t>
+      </w:r>
+    </w:p>
+    <w:p>
+      <w:r>
+        <w:t xml:space="preserve">SW1 (config) #aaa authorization </w:t>
       </w:r>
       <w:r>
         <w:rPr>
           <w:highlight w:val="yellow"/>
         </w:rPr>
-        <w:t>exec</w:t>
+        <w:t>network</w:t>
       </w:r>
       <w:r>
         <w:t xml:space="preserve"> </w:t>
@@ -2314,7 +2681,7 @@
         <w:rPr>
           <w:highlight w:val="green"/>
         </w:rPr>
-        <w:t>IWANTPRIV15</w:t>
+        <w:t>default</w:t>
       </w:r>
       <w:r>
         <w:t xml:space="preserve"> </w:t>
@@ -2323,700 +2690,236 @@
         <w:rPr>
           <w:highlight w:val="cyan"/>
         </w:rPr>
-        <w:t>none</w:t>
-      </w:r>
-    </w:p>
-    <w:p>
-      <w:r>
-        <w:t>R1 (config) #line console 0</w:t>
-      </w:r>
-    </w:p>
-    <w:p>
-      <w:r>
-        <w:t>R1 (config-line) #authorization exec IWANTPRIV15</w:t>
-      </w:r>
-    </w:p>
-    <w:p>
-      <w:pPr>
-        <w:rPr>
-          <w:b/>
-          <w:bCs/>
-        </w:rPr>
-      </w:pPr>
-      <w:r>
-        <w:rPr>
-          <w:b/>
-          <w:bCs/>
-        </w:rPr>
-        <w:t>Refer RADIUS for authentication &amp; authorization:</w:t>
-      </w:r>
-    </w:p>
-    <w:p>
-      <w:r>
-        <w:t>R1 (config) #</w:t>
-      </w:r>
-      <w:r>
-        <w:t xml:space="preserve">aaa authentication </w:t>
-      </w:r>
-      <w:r>
-        <w:rPr>
-          <w:highlight w:val="yellow"/>
-        </w:rPr>
-        <w:t>login</w:t>
+        <w:t>group radius</w:t>
+      </w:r>
+    </w:p>
+    <w:p>
+      <w:pPr>
+        <w:rPr>
+          <w:b/>
+          <w:bCs/>
+        </w:rPr>
+      </w:pPr>
+      <w:r>
+        <w:rPr>
+          <w:b/>
+          <w:bCs/>
+        </w:rPr>
+        <w:t>Enable the routing on the switch:</w:t>
+      </w:r>
+    </w:p>
+    <w:p>
+      <w:r>
+        <w:t>SW1 (config) #ip</w:t>
+      </w:r>
+      <w:r>
+        <w:t>-</w:t>
+      </w:r>
+      <w:r>
+        <w:t>routing</w:t>
+      </w:r>
+    </w:p>
+    <w:p>
+      <w:pPr>
+        <w:rPr>
+          <w:b/>
+          <w:bCs/>
+        </w:rPr>
+      </w:pPr>
+      <w:r>
+        <w:rPr>
+          <w:b/>
+          <w:bCs/>
+        </w:rPr>
+        <w:t>Enable the 802.1X protocol</w:t>
+      </w:r>
+      <w:r>
+        <w:rPr>
+          <w:b/>
+          <w:bCs/>
+        </w:rPr>
+        <w:t xml:space="preserve"> on the switch</w:t>
+      </w:r>
+      <w:r>
+        <w:rPr>
+          <w:b/>
+          <w:bCs/>
+        </w:rPr>
+        <w:t>:</w:t>
+      </w:r>
+    </w:p>
+    <w:p>
+      <w:r>
+        <w:t>SW1 (config) #dot1x system-auth-control</w:t>
+      </w:r>
+    </w:p>
+    <w:p>
+      <w:pPr>
+        <w:rPr>
+          <w:b/>
+          <w:bCs/>
+        </w:rPr>
+      </w:pPr>
+      <w:r>
+        <w:rPr>
+          <w:b/>
+          <w:bCs/>
+        </w:rPr>
+        <w:t>Create some VLANs</w:t>
+      </w:r>
+      <w:r>
+        <w:rPr>
+          <w:b/>
+          <w:bCs/>
+        </w:rPr>
+        <w:t xml:space="preserve"> (X times if X VLANs)</w:t>
+      </w:r>
+      <w:r>
+        <w:rPr>
+          <w:b/>
+          <w:bCs/>
+        </w:rPr>
+        <w:t>:</w:t>
+      </w:r>
+    </w:p>
+    <w:p>
+      <w:r>
+        <w:t>SW1 (config) #</w:t>
+      </w:r>
+      <w:r>
+        <w:t>int vlan 2</w:t>
+      </w:r>
+    </w:p>
+    <w:p>
+      <w:r>
+        <w:t>SW1 (config</w:t>
+      </w:r>
+      <w:r>
+        <w:t>-if</w:t>
+      </w:r>
+      <w:r>
+        <w:t>) #</w:t>
+      </w:r>
+      <w:r>
+        <w:t>ip address 192.168.2.254 255.255.255.0</w:t>
+      </w:r>
+    </w:p>
+    <w:p>
+      <w:pPr>
+        <w:rPr>
+          <w:b/>
+          <w:bCs/>
+        </w:rPr>
+      </w:pPr>
+      <w:r>
+        <w:rPr>
+          <w:b/>
+          <w:bCs/>
+        </w:rPr>
+        <w:t>Configure DHCP</w:t>
+      </w:r>
+      <w:r>
+        <w:rPr>
+          <w:b/>
+          <w:bCs/>
+        </w:rPr>
+        <w:t xml:space="preserve"> (X pools for X groups)</w:t>
+      </w:r>
+      <w:r>
+        <w:rPr>
+          <w:b/>
+          <w:bCs/>
+        </w:rPr>
+        <w:t>:</w:t>
+      </w:r>
+    </w:p>
+    <w:p>
+      <w:r>
+        <w:t>SW1 (config) #</w:t>
+      </w:r>
+      <w:r>
+        <w:t>ip dhcp excluded-address 192.168.2.2</w:t>
+      </w:r>
+      <w:r>
+        <w:t>54</w:t>
+      </w:r>
+      <w:r>
+        <w:t xml:space="preserve"> 192.168.2.254</w:t>
+      </w:r>
+    </w:p>
+    <w:p>
+      <w:r>
+        <w:t>SW1 (config) #</w:t>
+      </w:r>
+      <w:r>
+        <w:t xml:space="preserve">ip dhcp pool </w:t>
+      </w:r>
+      <w:r>
+        <w:t>GROUP2</w:t>
+      </w:r>
+    </w:p>
+    <w:p>
+      <w:r>
+        <w:t xml:space="preserve">SW1 </w:t>
+      </w:r>
+      <w:r>
+        <w:t>(dhcp-config) #network 192.168.2.0 255.255.255.0</w:t>
+      </w:r>
+    </w:p>
+    <w:p>
+      <w:r>
+        <w:t>SW</w:t>
+      </w:r>
+      <w:r>
+        <w:t>1</w:t>
       </w:r>
       <w:r>
         <w:t xml:space="preserve"> </w:t>
       </w:r>
       <w:r>
-        <w:rPr>
-          <w:highlight w:val="green"/>
-        </w:rPr>
-        <w:t>default</w:t>
-      </w:r>
-      <w:r>
-        <w:t xml:space="preserve"> </w:t>
-      </w:r>
-      <w:r>
-        <w:rPr>
-          <w:highlight w:val="cyan"/>
-        </w:rPr>
-        <w:t>group radius</w:t>
-      </w:r>
-      <w:r>
-        <w:br/>
-      </w:r>
-      <w:r>
-        <w:t>R1 (config) #</w:t>
-      </w:r>
-      <w:r>
-        <w:t xml:space="preserve">aaa authorization </w:t>
-      </w:r>
-      <w:r>
-        <w:rPr>
-          <w:highlight w:val="yellow"/>
-        </w:rPr>
-        <w:t>auth-proxy</w:t>
-      </w:r>
-      <w:r>
-        <w:t xml:space="preserve"> </w:t>
-      </w:r>
-      <w:r>
-        <w:rPr>
-          <w:highlight w:val="green"/>
-        </w:rPr>
-        <w:t>default</w:t>
-      </w:r>
-      <w:r>
-        <w:t xml:space="preserve"> </w:t>
-      </w:r>
-      <w:r>
-        <w:rPr>
-          <w:highlight w:val="cyan"/>
-        </w:rPr>
-        <w:t>group radius</w:t>
-      </w:r>
-    </w:p>
-    <w:p>
-      <w:pPr>
-        <w:rPr>
-          <w:b/>
-          <w:bCs/>
-        </w:rPr>
-      </w:pPr>
-      <w:r>
-        <w:rPr>
-          <w:b/>
-          <w:bCs/>
-        </w:rPr>
-        <w:t>Enable the web server on the router:</w:t>
-      </w:r>
-    </w:p>
-    <w:p>
-      <w:r>
-        <w:t>R1 (config) #ip http server</w:t>
-      </w:r>
-    </w:p>
-    <w:p>
-      <w:pPr>
-        <w:rPr>
-          <w:b/>
-          <w:bCs/>
-        </w:rPr>
-      </w:pPr>
-      <w:r>
-        <w:rPr>
-          <w:b/>
-          <w:bCs/>
-        </w:rPr>
-        <w:t>Enable AAA for the web server:</w:t>
-      </w:r>
-    </w:p>
-    <w:p>
-      <w:r>
-        <w:t xml:space="preserve">R1 (config) #ip http authentication </w:t>
-      </w:r>
-      <w:proofErr w:type="spellStart"/>
-      <w:r>
-        <w:t>aaa</w:t>
-      </w:r>
-      <w:proofErr w:type="spellEnd"/>
-    </w:p>
-    <w:p>
-      <w:pPr>
-        <w:rPr>
-          <w:b/>
-          <w:bCs/>
-        </w:rPr>
-      </w:pPr>
-      <w:r>
-        <w:rPr>
-          <w:b/>
-          <w:bCs/>
-        </w:rPr>
-        <w:t>Create ACL to permit the user access the web server:</w:t>
-      </w:r>
-    </w:p>
-    <w:p>
-      <w:r>
-        <w:t xml:space="preserve">R1 (config) #access-list 100 permit </w:t>
-      </w:r>
-      <w:proofErr w:type="spellStart"/>
-      <w:r>
-        <w:t>tcp</w:t>
-      </w:r>
-      <w:proofErr w:type="spellEnd"/>
-      <w:r>
-        <w:t xml:space="preserve"> 192.168.1.0 0.0.0.255 host 192.168.</w:t>
-      </w:r>
-      <w:r>
-        <w:t>1</w:t>
-      </w:r>
-      <w:r>
-        <w:t>.</w:t>
-      </w:r>
-      <w:r>
-        <w:t>254</w:t>
-      </w:r>
-      <w:r>
-        <w:t xml:space="preserve"> </w:t>
-      </w:r>
-      <w:proofErr w:type="spellStart"/>
-      <w:r>
-        <w:t>eq</w:t>
-      </w:r>
-      <w:proofErr w:type="spellEnd"/>
-      <w:r>
-        <w:t xml:space="preserve"> 80</w:t>
-      </w:r>
-    </w:p>
-    <w:p>
-      <w:r>
-        <w:t>R1 (config) #</w:t>
-      </w:r>
-      <w:r>
-        <w:t xml:space="preserve">access-list 100 deny </w:t>
-      </w:r>
-      <w:proofErr w:type="spellStart"/>
-      <w:r>
-        <w:t>ip</w:t>
-      </w:r>
-      <w:proofErr w:type="spellEnd"/>
-      <w:r>
-        <w:t xml:space="preserve"> 192.168.1.0 0.0.0.255 any</w:t>
-      </w:r>
-    </w:p>
-    <w:p>
-      <w:pPr>
-        <w:rPr>
-          <w:b/>
-          <w:bCs/>
-        </w:rPr>
-      </w:pPr>
-      <w:r>
-        <w:rPr>
-          <w:b/>
-          <w:bCs/>
-        </w:rPr>
-        <w:t>Configure the proxy:</w:t>
-      </w:r>
-    </w:p>
-    <w:p>
-      <w:r>
-        <w:t>R1 (config) #ip auth-proxy name HTTPPROXY http list 100</w:t>
-      </w:r>
-    </w:p>
-    <w:p>
-      <w:pPr>
-        <w:rPr>
-          <w:b/>
-          <w:bCs/>
-        </w:rPr>
-      </w:pPr>
-      <w:r>
-        <w:rPr>
-          <w:b/>
-          <w:bCs/>
-        </w:rPr>
-        <w:t>Apply the proxy and the ACL on the interface facing the user:</w:t>
-      </w:r>
-    </w:p>
-    <w:p>
-      <w:r>
-        <w:t>R1 (config) #int g0/0/0</w:t>
-      </w:r>
-    </w:p>
-    <w:p>
-      <w:r>
-        <w:t>R1 (config-if) #ip auth-proxy HTTPPROXY</w:t>
-      </w:r>
-    </w:p>
-    <w:p>
-      <w:r>
-        <w:t>R1 (config-if) #ip access-group 100</w:t>
-      </w:r>
-      <w:r>
-        <w:t xml:space="preserve"> in</w:t>
-      </w:r>
-    </w:p>
-    <w:p>
-      <w:r>
-        <w:br w:type="page"/>
-      </w:r>
-    </w:p>
-    <w:p>
-      <w:pPr>
-        <w:pStyle w:val="Titre1"/>
-      </w:pPr>
-      <w:bookmarkStart w:id="6" w:name="_Toc224829100"/>
-      <w:r>
-        <w:lastRenderedPageBreak/>
-        <w:t xml:space="preserve">802.1X Ethernet </w:t>
-      </w:r>
-      <w:r>
-        <w:t>access</w:t>
-      </w:r>
-      <w:bookmarkEnd w:id="6"/>
-    </w:p>
-    <w:p>
-      <w:pPr>
-        <w:pStyle w:val="Titre2"/>
-      </w:pPr>
-      <w:bookmarkStart w:id="7" w:name="_Toc224829101"/>
-      <w:r>
-        <w:t>On the authenticator device</w:t>
-      </w:r>
-      <w:bookmarkEnd w:id="7"/>
-    </w:p>
-    <w:p>
-      <w:pPr>
-        <w:rPr>
-          <w:b/>
-          <w:bCs/>
-        </w:rPr>
-      </w:pPr>
-      <w:r>
-        <w:rPr>
-          <w:b/>
-          <w:bCs/>
-        </w:rPr>
-        <w:t>On the authenticator switch, configure AAA:</w:t>
-      </w:r>
-    </w:p>
-    <w:p>
-      <w:r>
-        <w:t xml:space="preserve">SW1 (config) #aaa </w:t>
-      </w:r>
-      <w:proofErr w:type="gramStart"/>
-      <w:r>
-        <w:t>new-model</w:t>
-      </w:r>
-      <w:proofErr w:type="gramEnd"/>
-    </w:p>
-    <w:p>
-      <w:r>
-        <w:t>SW1 (config) #</w:t>
-      </w:r>
-      <w:r>
-        <w:t xml:space="preserve">radius-server host </w:t>
-      </w:r>
-      <w:r>
-        <w:rPr>
-          <w:i/>
-          <w:iCs/>
+        <w:t>(dhcp-config) #default-router 192.168.2.254</w:t>
+      </w:r>
+    </w:p>
+    <w:p>
+      <w:r>
+        <w:t>SW1 (config) #service dhcp</w:t>
+      </w:r>
+    </w:p>
+    <w:p>
+      <w:pPr>
+        <w:rPr>
+          <w:b/>
+          <w:bCs/>
+        </w:rPr>
+      </w:pPr>
+      <w:r>
+        <w:rPr>
+          <w:b/>
+          <w:bCs/>
+        </w:rPr>
+        <w:t>On each interface facing end user:</w:t>
+      </w:r>
+    </w:p>
+    <w:p>
+      <w:pPr>
+        <w:rPr>
           <w:sz w:val="20"/>
           <w:szCs w:val="20"/>
         </w:rPr>
-        <w:t>radius-server-</w:t>
-      </w:r>
-      <w:proofErr w:type="spellStart"/>
-      <w:r>
-        <w:rPr>
-          <w:i/>
-          <w:iCs/>
+      </w:pPr>
+      <w:r>
+        <w:rPr>
           <w:sz w:val="20"/>
           <w:szCs w:val="20"/>
         </w:rPr>
-        <w:t>ip</w:t>
-      </w:r>
-      <w:proofErr w:type="spellEnd"/>
-      <w:r>
-        <w:t xml:space="preserve"> key </w:t>
-      </w:r>
-      <w:r>
-        <w:rPr>
-          <w:i/>
-          <w:iCs/>
+        <w:t>SW1 (config-if) #</w:t>
+      </w:r>
+      <w:r>
+        <w:rPr>
           <w:sz w:val="20"/>
           <w:szCs w:val="20"/>
         </w:rPr>
-        <w:t>shared-key</w:t>
-      </w:r>
-    </w:p>
-    <w:p>
-      <w:r>
-        <w:t>SW1 (config) #</w:t>
-      </w:r>
-      <w:r>
-        <w:t xml:space="preserve">aaa authentication </w:t>
-      </w:r>
-      <w:r>
-        <w:rPr>
-          <w:highlight w:val="yellow"/>
-        </w:rPr>
-        <w:t>dot1x</w:t>
-      </w:r>
-      <w:r>
-        <w:t xml:space="preserve"> </w:t>
-      </w:r>
-      <w:r>
-        <w:rPr>
-          <w:highlight w:val="green"/>
-        </w:rPr>
-        <w:t>default</w:t>
-      </w:r>
-      <w:r>
-        <w:t xml:space="preserve"> </w:t>
-      </w:r>
-      <w:r>
-        <w:rPr>
-          <w:highlight w:val="cyan"/>
-        </w:rPr>
-        <w:t>group radius</w:t>
-      </w:r>
-    </w:p>
-    <w:p>
-      <w:r>
-        <w:t>SW1 (config) #</w:t>
-      </w:r>
-      <w:r>
-        <w:t xml:space="preserve">aaa authorization </w:t>
-      </w:r>
-      <w:r>
-        <w:rPr>
-          <w:highlight w:val="yellow"/>
-        </w:rPr>
-        <w:t>network</w:t>
-      </w:r>
-      <w:r>
-        <w:t xml:space="preserve"> </w:t>
-      </w:r>
-      <w:r>
-        <w:rPr>
-          <w:highlight w:val="green"/>
-        </w:rPr>
-        <w:t>default</w:t>
-      </w:r>
-      <w:r>
-        <w:t xml:space="preserve"> </w:t>
-      </w:r>
-      <w:r>
-        <w:rPr>
-          <w:highlight w:val="cyan"/>
-        </w:rPr>
-        <w:t>group radius</w:t>
-      </w:r>
-    </w:p>
-    <w:p>
-      <w:pPr>
-        <w:rPr>
-          <w:b/>
-          <w:bCs/>
-        </w:rPr>
-      </w:pPr>
-      <w:r>
-        <w:rPr>
-          <w:b/>
-          <w:bCs/>
-        </w:rPr>
-        <w:t>Enable the routing on the switch:</w:t>
-      </w:r>
-    </w:p>
-    <w:p>
-      <w:r>
-        <w:t>SW1 (config) #</w:t>
-      </w:r>
-      <w:r>
-        <w:t>ip</w:t>
-      </w:r>
-      <w:r>
-        <w:t>-</w:t>
-      </w:r>
-      <w:r>
-        <w:t>routing</w:t>
-      </w:r>
-    </w:p>
-    <w:p>
-      <w:pPr>
-        <w:rPr>
-          <w:b/>
-          <w:bCs/>
-        </w:rPr>
-      </w:pPr>
-      <w:r>
-        <w:rPr>
-          <w:b/>
-          <w:bCs/>
-        </w:rPr>
-        <w:t xml:space="preserve">Enable the </w:t>
-      </w:r>
-      <w:r>
-        <w:rPr>
-          <w:b/>
-          <w:bCs/>
-        </w:rPr>
-        <w:t>802.1X</w:t>
-      </w:r>
-      <w:r>
-        <w:rPr>
-          <w:b/>
-          <w:bCs/>
-        </w:rPr>
-        <w:t xml:space="preserve"> protocol</w:t>
-      </w:r>
-      <w:r>
-        <w:rPr>
-          <w:b/>
-          <w:bCs/>
-        </w:rPr>
-        <w:t xml:space="preserve"> on the switch</w:t>
-      </w:r>
-      <w:r>
-        <w:rPr>
-          <w:b/>
-          <w:bCs/>
-        </w:rPr>
-        <w:t>:</w:t>
-      </w:r>
-    </w:p>
-    <w:p>
-      <w:r>
-        <w:t>SW1 (config) #</w:t>
-      </w:r>
-      <w:r>
-        <w:t>dot1x system-auth-control</w:t>
-      </w:r>
-    </w:p>
-    <w:p>
-      <w:pPr>
-        <w:rPr>
-          <w:b/>
-          <w:bCs/>
-        </w:rPr>
-      </w:pPr>
-      <w:r>
-        <w:rPr>
-          <w:b/>
-          <w:bCs/>
-        </w:rPr>
-        <w:t>Create some VLANs</w:t>
-      </w:r>
-      <w:r>
-        <w:rPr>
-          <w:b/>
-          <w:bCs/>
-        </w:rPr>
-        <w:t xml:space="preserve"> (X times if X VLANs)</w:t>
-      </w:r>
-      <w:r>
-        <w:rPr>
-          <w:b/>
-          <w:bCs/>
-        </w:rPr>
-        <w:t>:</w:t>
-      </w:r>
-    </w:p>
-    <w:p>
-      <w:r>
-        <w:t>SW1 (config) #</w:t>
-      </w:r>
-      <w:r>
-        <w:t xml:space="preserve">int </w:t>
-      </w:r>
-      <w:proofErr w:type="spellStart"/>
-      <w:r>
-        <w:t>vlan</w:t>
-      </w:r>
-      <w:proofErr w:type="spellEnd"/>
-      <w:r>
-        <w:t xml:space="preserve"> 2</w:t>
-      </w:r>
-    </w:p>
-    <w:p>
-      <w:r>
-        <w:t>SW1 (config</w:t>
-      </w:r>
-      <w:r>
-        <w:t>-if</w:t>
-      </w:r>
-      <w:r>
-        <w:t>) #</w:t>
-      </w:r>
-      <w:r>
-        <w:t>ip address 192.168.2.254 255.255.255.0</w:t>
-      </w:r>
-    </w:p>
-    <w:p>
-      <w:pPr>
-        <w:rPr>
-          <w:b/>
-          <w:bCs/>
-        </w:rPr>
-      </w:pPr>
-      <w:r>
-        <w:rPr>
-          <w:b/>
-          <w:bCs/>
-        </w:rPr>
-        <w:t>Configure DHCP</w:t>
-      </w:r>
-      <w:r>
-        <w:rPr>
-          <w:b/>
-          <w:bCs/>
-        </w:rPr>
-        <w:t xml:space="preserve"> (X pools for X groups)</w:t>
-      </w:r>
-      <w:r>
-        <w:rPr>
-          <w:b/>
-          <w:bCs/>
-        </w:rPr>
-        <w:t>:</w:t>
-      </w:r>
-    </w:p>
-    <w:p>
-      <w:r>
-        <w:t>SW1 (config) #</w:t>
-      </w:r>
-      <w:r>
-        <w:t xml:space="preserve">ip </w:t>
-      </w:r>
-      <w:proofErr w:type="spellStart"/>
-      <w:r>
-        <w:t>dhcp</w:t>
-      </w:r>
-      <w:proofErr w:type="spellEnd"/>
-      <w:r>
-        <w:t xml:space="preserve"> </w:t>
-      </w:r>
-      <w:proofErr w:type="gramStart"/>
-      <w:r>
-        <w:t>excluded-address</w:t>
-      </w:r>
-      <w:proofErr w:type="gramEnd"/>
-      <w:r>
-        <w:t xml:space="preserve"> 192.168.2.2</w:t>
-      </w:r>
-      <w:r>
-        <w:t>54</w:t>
-      </w:r>
-      <w:r>
-        <w:t xml:space="preserve"> 192.168.2.254</w:t>
-      </w:r>
-    </w:p>
-    <w:p>
-      <w:r>
-        <w:t>SW1 (config) #</w:t>
-      </w:r>
-      <w:r>
-        <w:t xml:space="preserve">ip </w:t>
-      </w:r>
-      <w:proofErr w:type="spellStart"/>
-      <w:r>
-        <w:t>dhcp</w:t>
-      </w:r>
-      <w:proofErr w:type="spellEnd"/>
-      <w:r>
-        <w:t xml:space="preserve"> pool </w:t>
-      </w:r>
-      <w:r>
-        <w:t>GROUP2</w:t>
-      </w:r>
-    </w:p>
-    <w:p>
-      <w:r>
-        <w:t>SW1</w:t>
-      </w:r>
-      <w:r>
-        <w:t xml:space="preserve"> </w:t>
-      </w:r>
-      <w:r>
-        <w:t>(</w:t>
-      </w:r>
-      <w:proofErr w:type="spellStart"/>
-      <w:r>
-        <w:t>dhcp</w:t>
-      </w:r>
-      <w:proofErr w:type="spellEnd"/>
-      <w:r>
-        <w:t>-config) #network 192.168.2.0 255.255.255.0</w:t>
-      </w:r>
-    </w:p>
-    <w:p>
-      <w:r>
-        <w:t>SW</w:t>
-      </w:r>
-      <w:r>
-        <w:t>1</w:t>
-      </w:r>
-      <w:r>
-        <w:t xml:space="preserve"> </w:t>
-      </w:r>
-      <w:r>
-        <w:t>(</w:t>
-      </w:r>
-      <w:proofErr w:type="spellStart"/>
-      <w:r>
-        <w:t>dhcp</w:t>
-      </w:r>
-      <w:proofErr w:type="spellEnd"/>
-      <w:r>
-        <w:t>-config) #default-router 192.168.2.254</w:t>
-      </w:r>
-    </w:p>
-    <w:p>
-      <w:r>
-        <w:t xml:space="preserve">SW1 (config) #service </w:t>
-      </w:r>
-      <w:proofErr w:type="spellStart"/>
-      <w:r>
-        <w:t>dhcp</w:t>
-      </w:r>
-      <w:proofErr w:type="spellEnd"/>
-    </w:p>
-    <w:p>
-      <w:pPr>
-        <w:rPr>
-          <w:b/>
-          <w:bCs/>
-        </w:rPr>
-      </w:pPr>
-      <w:r>
-        <w:rPr>
-          <w:b/>
-          <w:bCs/>
-        </w:rPr>
-        <w:t>On each interface facing end user:</w:t>
+        <w:t>spanning-tree portfast</w:t>
       </w:r>
     </w:p>
     <w:p>
@@ -3031,38 +2934,89 @@
           <w:sz w:val="20"/>
           <w:szCs w:val="20"/>
         </w:rPr>
-        <w:t>SW1 (config</w:t>
-      </w:r>
-      <w:r>
+        <w:t>SW1 (config-if) #switchport mode access</w:t>
+      </w:r>
+    </w:p>
+    <w:p>
+      <w:pPr>
+        <w:rPr>
+          <w:b/>
+          <w:bCs/>
+        </w:rPr>
+      </w:pPr>
+      <w:r>
+        <w:rPr>
+          <w:b/>
+          <w:bCs/>
+        </w:rPr>
+        <w:t>On each interface facing end user</w:t>
+      </w:r>
+      <w:r>
+        <w:rPr>
+          <w:b/>
+          <w:bCs/>
+        </w:rPr>
+        <w:t>, e</w:t>
+      </w:r>
+      <w:r>
+        <w:rPr>
+          <w:b/>
+          <w:bCs/>
+        </w:rPr>
+        <w:t>nable 802.1X verifications on the interface</w:t>
+      </w:r>
+      <w:r>
+        <w:rPr>
+          <w:b/>
+          <w:bCs/>
+        </w:rPr>
+        <w:t>:</w:t>
+      </w:r>
+    </w:p>
+    <w:p>
+      <w:pPr>
         <w:rPr>
           <w:sz w:val="20"/>
           <w:szCs w:val="20"/>
         </w:rPr>
-        <w:t>-if</w:t>
-      </w:r>
+      </w:pPr>
       <w:r>
         <w:rPr>
           <w:sz w:val="20"/>
           <w:szCs w:val="20"/>
         </w:rPr>
-        <w:t>) #</w:t>
-      </w:r>
-      <w:r>
+        <w:t>SW1 (config-if) #dot1x port-control auto</w:t>
+      </w:r>
+    </w:p>
+    <w:p>
+      <w:pPr>
+        <w:rPr>
+          <w:sz w:val="10"/>
+          <w:szCs w:val="10"/>
+        </w:rPr>
+      </w:pPr>
+      <w:r>
+        <w:rPr>
+          <w:sz w:val="10"/>
+          <w:szCs w:val="10"/>
+        </w:rPr>
+        <w:t>Or</w:t>
+      </w:r>
+    </w:p>
+    <w:p>
+      <w:pPr>
         <w:rPr>
           <w:sz w:val="20"/>
           <w:szCs w:val="20"/>
         </w:rPr>
-        <w:t xml:space="preserve">spanning-tree </w:t>
-      </w:r>
-      <w:proofErr w:type="spellStart"/>
+      </w:pPr>
       <w:r>
         <w:rPr>
           <w:sz w:val="20"/>
           <w:szCs w:val="20"/>
         </w:rPr>
-        <w:t>portfast</w:t>
-      </w:r>
-      <w:proofErr w:type="spellEnd"/>
+        <w:t>SW1 (config-if) #dot1x pae authenticator</w:t>
+      </w:r>
     </w:p>
     <w:p>
       <w:pPr>
@@ -3076,256 +3030,102 @@
           <w:sz w:val="20"/>
           <w:szCs w:val="20"/>
         </w:rPr>
-        <w:t>SW1 (config-if) #</w:t>
-      </w:r>
-      <w:r>
+        <w:t>SW1 (config-if) #authentication port-control auto</w:t>
+      </w:r>
+    </w:p>
+    <w:p>
+      <w:pPr>
+        <w:rPr>
+          <w:b/>
+          <w:bCs/>
+        </w:rPr>
+      </w:pPr>
+      <w:r>
+        <w:rPr>
+          <w:b/>
+          <w:bCs/>
+        </w:rPr>
+        <w:t>If 2 MAC addresses</w:t>
+      </w:r>
+      <w:r>
+        <w:rPr>
+          <w:b/>
+          <w:bCs/>
+        </w:rPr>
+        <w:t xml:space="preserve"> are</w:t>
+      </w:r>
+      <w:r>
+        <w:rPr>
+          <w:b/>
+          <w:bCs/>
+        </w:rPr>
+        <w:t xml:space="preserve"> on the same interface</w:t>
+      </w:r>
+      <w:r>
+        <w:rPr>
+          <w:b/>
+          <w:bCs/>
+        </w:rPr>
+        <w:t>, o</w:t>
+      </w:r>
+      <w:r>
+        <w:rPr>
+          <w:b/>
+          <w:bCs/>
+        </w:rPr>
+        <w:t>n each interface facing end user</w:t>
+      </w:r>
+      <w:r>
+        <w:rPr>
+          <w:b/>
+          <w:bCs/>
+        </w:rPr>
+        <w:t>:</w:t>
+      </w:r>
+    </w:p>
+    <w:p>
+      <w:pPr>
         <w:rPr>
           <w:sz w:val="20"/>
           <w:szCs w:val="20"/>
         </w:rPr>
-        <w:t>switchport mode access</w:t>
-      </w:r>
-    </w:p>
-    <w:p>
-      <w:pPr>
-        <w:rPr>
-          <w:b/>
-          <w:bCs/>
-        </w:rPr>
-      </w:pPr>
-      <w:r>
-        <w:rPr>
-          <w:b/>
-          <w:bCs/>
-        </w:rPr>
-        <w:t>On each interface facing end user</w:t>
-      </w:r>
-      <w:r>
-        <w:rPr>
-          <w:b/>
-          <w:bCs/>
-        </w:rPr>
-        <w:t>, e</w:t>
-      </w:r>
-      <w:r>
-        <w:rPr>
-          <w:b/>
-          <w:bCs/>
-        </w:rPr>
-        <w:t>nable 802.1X verifications on the interface</w:t>
-      </w:r>
-      <w:r>
-        <w:rPr>
-          <w:b/>
-          <w:bCs/>
-        </w:rPr>
-        <w:t>:</w:t>
-      </w:r>
-    </w:p>
-    <w:p>
-      <w:pPr>
+      </w:pPr>
+      <w:r>
         <w:rPr>
           <w:sz w:val="20"/>
           <w:szCs w:val="20"/>
         </w:rPr>
-      </w:pPr>
-      <w:r>
+        <w:t>SW1 (config-if) #authentication host-mode multi-host</w:t>
+      </w:r>
+    </w:p>
+    <w:p>
+      <w:pPr>
+        <w:rPr>
+          <w:sz w:val="10"/>
+          <w:szCs w:val="10"/>
+        </w:rPr>
+      </w:pPr>
+      <w:r>
+        <w:rPr>
+          <w:sz w:val="10"/>
+          <w:szCs w:val="10"/>
+        </w:rPr>
+        <w:t>Or</w:t>
+      </w:r>
+    </w:p>
+    <w:p>
+      <w:pPr>
         <w:rPr>
           <w:sz w:val="20"/>
           <w:szCs w:val="20"/>
         </w:rPr>
-        <w:t>SW1 (config-if) #</w:t>
-      </w:r>
+      </w:pPr>
       <w:r>
         <w:rPr>
           <w:sz w:val="20"/>
           <w:szCs w:val="20"/>
         </w:rPr>
-        <w:t>dot1x port-control auto</w:t>
-      </w:r>
-    </w:p>
-    <w:p>
-      <w:pPr>
-        <w:rPr>
-          <w:sz w:val="10"/>
-          <w:szCs w:val="10"/>
-        </w:rPr>
-      </w:pPr>
-      <w:r>
-        <w:rPr>
-          <w:sz w:val="10"/>
-          <w:szCs w:val="10"/>
-        </w:rPr>
-        <w:t>Or</w:t>
-      </w:r>
-    </w:p>
-    <w:p>
-      <w:pPr>
-        <w:rPr>
-          <w:sz w:val="20"/>
-          <w:szCs w:val="20"/>
-        </w:rPr>
-      </w:pPr>
-      <w:r>
-        <w:rPr>
-          <w:sz w:val="20"/>
-          <w:szCs w:val="20"/>
-        </w:rPr>
-        <w:t>SW1 (config-if) #</w:t>
-      </w:r>
-      <w:r>
-        <w:rPr>
-          <w:sz w:val="20"/>
-          <w:szCs w:val="20"/>
-        </w:rPr>
-        <w:t xml:space="preserve">dot1x </w:t>
-      </w:r>
-      <w:proofErr w:type="spellStart"/>
-      <w:r>
-        <w:rPr>
-          <w:sz w:val="20"/>
-          <w:szCs w:val="20"/>
-        </w:rPr>
-        <w:t>pae</w:t>
-      </w:r>
-      <w:proofErr w:type="spellEnd"/>
-      <w:r>
-        <w:rPr>
-          <w:sz w:val="20"/>
-          <w:szCs w:val="20"/>
-        </w:rPr>
-        <w:t xml:space="preserve"> authenticator</w:t>
-      </w:r>
-    </w:p>
-    <w:p>
-      <w:pPr>
-        <w:rPr>
-          <w:sz w:val="20"/>
-          <w:szCs w:val="20"/>
-        </w:rPr>
-      </w:pPr>
-      <w:r>
-        <w:rPr>
-          <w:sz w:val="20"/>
-          <w:szCs w:val="20"/>
-        </w:rPr>
-        <w:t>SW1 (config-if) #</w:t>
-      </w:r>
-      <w:r>
-        <w:rPr>
-          <w:sz w:val="20"/>
-          <w:szCs w:val="20"/>
-        </w:rPr>
-        <w:t>authentication port-control auto</w:t>
-      </w:r>
-    </w:p>
-    <w:p>
-      <w:pPr>
-        <w:rPr>
-          <w:b/>
-          <w:bCs/>
-        </w:rPr>
-      </w:pPr>
-      <w:r>
-        <w:rPr>
-          <w:b/>
-          <w:bCs/>
-        </w:rPr>
-        <w:t>If 2 MAC addresses</w:t>
-      </w:r>
-      <w:r>
-        <w:rPr>
-          <w:b/>
-          <w:bCs/>
-        </w:rPr>
-        <w:t xml:space="preserve"> are</w:t>
-      </w:r>
-      <w:r>
-        <w:rPr>
-          <w:b/>
-          <w:bCs/>
-        </w:rPr>
-        <w:t xml:space="preserve"> on the same interface</w:t>
-      </w:r>
-      <w:r>
-        <w:rPr>
-          <w:b/>
-          <w:bCs/>
-        </w:rPr>
-        <w:t>, o</w:t>
-      </w:r>
-      <w:r>
-        <w:rPr>
-          <w:b/>
-          <w:bCs/>
-        </w:rPr>
-        <w:t>n each interface facing end user</w:t>
-      </w:r>
-      <w:r>
-        <w:rPr>
-          <w:b/>
-          <w:bCs/>
-        </w:rPr>
-        <w:t>:</w:t>
-      </w:r>
-    </w:p>
-    <w:p>
-      <w:pPr>
-        <w:rPr>
-          <w:sz w:val="20"/>
-          <w:szCs w:val="20"/>
-        </w:rPr>
-      </w:pPr>
-      <w:r>
-        <w:rPr>
-          <w:sz w:val="20"/>
-          <w:szCs w:val="20"/>
-        </w:rPr>
-        <w:t>SW1 (config-if) #</w:t>
-      </w:r>
-      <w:r>
-        <w:rPr>
-          <w:sz w:val="20"/>
-          <w:szCs w:val="20"/>
-        </w:rPr>
-        <w:t>authentication host-mode multi-host</w:t>
-      </w:r>
-    </w:p>
-    <w:p>
-      <w:pPr>
-        <w:rPr>
-          <w:sz w:val="10"/>
-          <w:szCs w:val="10"/>
-        </w:rPr>
-      </w:pPr>
-      <w:r>
-        <w:rPr>
-          <w:sz w:val="10"/>
-          <w:szCs w:val="10"/>
-        </w:rPr>
-        <w:t>Or</w:t>
-      </w:r>
-    </w:p>
-    <w:p>
-      <w:pPr>
-        <w:rPr>
-          <w:sz w:val="20"/>
-          <w:szCs w:val="20"/>
-        </w:rPr>
-      </w:pPr>
-      <w:r>
-        <w:rPr>
-          <w:sz w:val="20"/>
-          <w:szCs w:val="20"/>
-        </w:rPr>
-        <w:t>SW1 (config-if) #</w:t>
-      </w:r>
-      <w:r>
-        <w:rPr>
-          <w:sz w:val="20"/>
-          <w:szCs w:val="20"/>
-        </w:rPr>
-        <w:t>dot1x host-mode multi-host</w:t>
+        <w:t>SW1 (config-if) #dot1x host-mode multi-host</w:t>
       </w:r>
     </w:p>
     <w:p>
@@ -3360,26 +3160,8 @@
           <w:bCs/>
           <w:lang w:val="fr-BE"/>
         </w:rPr>
-        <w:t>(Configuration automatique du réseau câblé in french</w:t>
-      </w:r>
-      <w:proofErr w:type="gramStart"/>
-      <w:r>
-        <w:rPr>
-          <w:b/>
-          <w:bCs/>
-          <w:lang w:val="fr-BE"/>
-        </w:rPr>
-        <w:t>)</w:t>
-      </w:r>
-      <w:r>
-        <w:rPr>
-          <w:b/>
-          <w:bCs/>
-          <w:lang w:val="fr-BE"/>
-        </w:rPr>
-        <w:t>:</w:t>
-      </w:r>
-      <w:proofErr w:type="gramEnd"/>
+        <w:t>(Configuration automatique du réseau câblé in french):</w:t>
+      </w:r>
     </w:p>
     <w:p>
       <w:pPr>
@@ -3389,22 +3171,15 @@
           <w:numId w:val="4"/>
         </w:numPr>
       </w:pPr>
-      <w:proofErr w:type="spellStart"/>
-      <w:r>
-        <w:t>Win+R</w:t>
-      </w:r>
-      <w:proofErr w:type="spellEnd"/>
-      <w:r>
-        <w:t xml:space="preserve"> </w:t>
+      <w:r>
+        <w:t xml:space="preserve">Win+R </w:t>
       </w:r>
       <w:r>
         <w:sym w:font="Wingdings" w:char="F0E0"/>
       </w:r>
-      <w:proofErr w:type="spellStart"/>
       <w:r>
         <w:t>services.msc</w:t>
       </w:r>
-      <w:proofErr w:type="spellEnd"/>
     </w:p>
     <w:p>
       <w:pPr>
@@ -3429,6 +3204,9 @@
         <w:jc w:val="center"/>
       </w:pPr>
       <w:r>
+        <w:rPr>
+          <w:noProof/>
+        </w:rPr>
         <w:drawing>
           <wp:inline distT="0" distB="0" distL="0" distR="0" wp14:anchorId="2311DD9C" wp14:editId="4BF369F8">
             <wp:extent cx="4057865" cy="2133600"/>
@@ -3516,15 +3294,7 @@
         </w:numPr>
       </w:pPr>
       <w:r>
-        <w:t xml:space="preserve">Convert it to </w:t>
-      </w:r>
-      <w:proofErr w:type="gramStart"/>
-      <w:r>
-        <w:t>a .DER</w:t>
-      </w:r>
-      <w:proofErr w:type="gramEnd"/>
-      <w:r>
-        <w:t xml:space="preserve"> format</w:t>
+        <w:t>Convert it to a .DER format</w:t>
       </w:r>
     </w:p>
     <w:p>
@@ -3580,22 +3350,15 @@
       <w:r>
         <w:sym w:font="Wingdings" w:char="F0E0"/>
       </w:r>
-      <w:proofErr w:type="spellStart"/>
-      <w:r>
-        <w:t>Win+R</w:t>
-      </w:r>
-      <w:proofErr w:type="spellEnd"/>
-      <w:r>
-        <w:t xml:space="preserve"> </w:t>
+      <w:r>
+        <w:t xml:space="preserve">Win+R </w:t>
       </w:r>
       <w:r>
         <w:sym w:font="Wingdings" w:char="F0E0"/>
       </w:r>
-      <w:proofErr w:type="spellStart"/>
       <w:r>
         <w:t>ncpa.cpl</w:t>
       </w:r>
-      <w:proofErr w:type="spellEnd"/>
     </w:p>
     <w:p>
       <w:pPr>
@@ -3769,6 +3532,7 @@
       </w:pPr>
       <w:r>
         <w:rPr>
+          <w:noProof/>
           <w:sz w:val="20"/>
           <w:szCs w:val="20"/>
         </w:rPr>
@@ -3818,6 +3582,7 @@
       </w:pPr>
       <w:r>
         <w:rPr>
+          <w:noProof/>
           <w:sz w:val="20"/>
           <w:szCs w:val="20"/>
         </w:rPr>
@@ -3868,6 +3633,7 @@
       </w:pPr>
       <w:r>
         <w:rPr>
+          <w:noProof/>
           <w:sz w:val="20"/>
           <w:szCs w:val="20"/>
         </w:rPr>
@@ -4544,16 +4310,11 @@
       <w:r>
         <w:t xml:space="preserve"> Create a new policy (click </w:t>
       </w:r>
-      <w:proofErr w:type="gramStart"/>
       <w:r>
         <w:t>on</w:t>
       </w:r>
       <w:r>
-        <w:t xml:space="preserve"> ”</w:t>
-      </w:r>
-      <w:proofErr w:type="gramEnd"/>
-      <w:r>
-        <w:t>+”</w:t>
+        <w:t xml:space="preserve"> ”+”</w:t>
       </w:r>
       <w:r>
         <w:t xml:space="preserve">) </w:t>
@@ -4793,16 +4554,11 @@
       <w:r>
         <w:t xml:space="preserve">click </w:t>
       </w:r>
-      <w:proofErr w:type="gramStart"/>
       <w:r>
         <w:t>on</w:t>
       </w:r>
       <w:r>
-        <w:t xml:space="preserve"> ”</w:t>
-      </w:r>
-      <w:proofErr w:type="gramEnd"/>
-      <w:r>
-        <w:t>+”</w:t>
+        <w:t xml:space="preserve"> ”+”</w:t>
       </w:r>
       <w:r>
         <w:t>)</w:t>
@@ -4924,18 +4680,10 @@
     </w:p>
     <w:p>
       <w:r>
-        <w:t xml:space="preserve">In the </w:t>
-      </w:r>
-      <w:proofErr w:type="gramStart"/>
-      <w:r>
-        <w:t xml:space="preserve">column </w:t>
-      </w:r>
-      <w:r>
-        <w:t>”View</w:t>
-      </w:r>
-      <w:proofErr w:type="gramEnd"/>
-      <w:r>
-        <w:t xml:space="preserve">” click </w:t>
+        <w:t xml:space="preserve">In the column </w:t>
+      </w:r>
+      <w:r>
+        <w:t xml:space="preserve">”View” click </w:t>
       </w:r>
       <w:r>
         <w:t>on the right arrow</w:t>
@@ -4984,11 +4732,7 @@
     </w:p>
     <w:p>
       <w:r>
-        <w:t xml:space="preserve">In the </w:t>
-      </w:r>
-      <w:proofErr w:type="gramStart"/>
-      <w:r>
-        <w:t>column</w:t>
+        <w:t>In the column</w:t>
       </w:r>
       <w:r>
         <w:t xml:space="preserve"> </w:t>
@@ -5002,7 +4746,6 @@
       <w:r>
         <w:t>Use</w:t>
       </w:r>
-      <w:proofErr w:type="gramEnd"/>
       <w:r>
         <w:rPr>
           <w:rFonts w:ascii="Aptos" w:hAnsi="Aptos" w:cs="Aptos"/>
@@ -5170,13 +4913,8 @@
       <w:r>
         <w:t xml:space="preserve">ose the </w:t>
       </w:r>
-      <w:proofErr w:type="gramStart"/>
-      <w:r>
-        <w:t>icon ”Identity</w:t>
-      </w:r>
-      <w:proofErr w:type="gramEnd"/>
-      <w:r>
-        <w:t xml:space="preserve"> Group-Name” </w:t>
+      <w:r>
+        <w:t xml:space="preserve">icon ”Identity Group-Name” </w:t>
       </w:r>
       <w:r>
         <w:sym w:font="Wingdings" w:char="F0E0"/>
@@ -5199,18 +4937,10 @@
     </w:p>
     <w:p>
       <w:r>
-        <w:t xml:space="preserve">In the </w:t>
-      </w:r>
-      <w:proofErr w:type="gramStart"/>
-      <w:r>
-        <w:t>column</w:t>
-      </w:r>
-      <w:r>
-        <w:t xml:space="preserve"> ”Results</w:t>
-      </w:r>
-      <w:proofErr w:type="gramEnd"/>
-      <w:r>
-        <w:t>/Profiles”</w:t>
+        <w:t>In the column</w:t>
+      </w:r>
+      <w:r>
+        <w:t xml:space="preserve"> ”Results/Profiles”</w:t>
       </w:r>
       <w:r>
         <w:t xml:space="preserve"> (</w:t>
@@ -5218,16 +4948,11 @@
       <w:r>
         <w:t xml:space="preserve">click </w:t>
       </w:r>
-      <w:proofErr w:type="gramStart"/>
       <w:r>
         <w:t>on</w:t>
       </w:r>
       <w:r>
-        <w:t xml:space="preserve"> ”</w:t>
-      </w:r>
-      <w:proofErr w:type="gramEnd"/>
-      <w:r>
-        <w:t>+”</w:t>
+        <w:t xml:space="preserve"> ”+”</w:t>
       </w:r>
       <w:r>
         <w:t xml:space="preserve">) </w:t>
@@ -5236,29 +4961,16 @@
         <w:sym w:font="Wingdings" w:char="F0E0"/>
       </w:r>
       <w:r>
-        <w:t xml:space="preserve">Create </w:t>
-      </w:r>
-      <w:proofErr w:type="gramStart"/>
-      <w:r>
-        <w:t>a</w:t>
-      </w:r>
-      <w:r>
-        <w:t xml:space="preserve"> ”New</w:t>
-      </w:r>
-      <w:proofErr w:type="gramEnd"/>
-      <w:r>
-        <w:t xml:space="preserve"> authorization profile” (click </w:t>
-      </w:r>
-      <w:proofErr w:type="gramStart"/>
+        <w:t>Create a</w:t>
+      </w:r>
+      <w:r>
+        <w:t xml:space="preserve"> ”New authorization profile” (click </w:t>
+      </w:r>
       <w:r>
         <w:t>on</w:t>
       </w:r>
       <w:r>
-        <w:t xml:space="preserve"> ”</w:t>
-      </w:r>
-      <w:proofErr w:type="gramEnd"/>
-      <w:r>
-        <w:t>+”)</w:t>
+        <w:t xml:space="preserve"> ”+”)</w:t>
       </w:r>
       <w:r>
         <w:t xml:space="preserve"> </w:t>
@@ -5279,15 +4991,7 @@
         <w:t>r a</w:t>
       </w:r>
       <w:r>
-        <w:t xml:space="preserve"> cisco </w:t>
-      </w:r>
-      <w:proofErr w:type="spellStart"/>
-      <w:r>
-        <w:t>av</w:t>
-      </w:r>
-      <w:proofErr w:type="spellEnd"/>
-      <w:r>
-        <w:t>-pair</w:t>
+        <w:t xml:space="preserve"> cisco av-pair</w:t>
       </w:r>
       <w:r>
         <w:t>)</w:t>
@@ -5306,18 +5010,10 @@
     </w:p>
     <w:p>
       <w:r>
-        <w:t xml:space="preserve">In the column Use </w:t>
-      </w:r>
-      <w:proofErr w:type="gramStart"/>
-      <w:r>
-        <w:t>choose</w:t>
-      </w:r>
-      <w:r>
-        <w:t xml:space="preserve"> ”Internal</w:t>
-      </w:r>
-      <w:proofErr w:type="gramEnd"/>
-      <w:r>
-        <w:t xml:space="preserve"> Users” </w:t>
+        <w:t>In the column Use choose</w:t>
+      </w:r>
+      <w:r>
+        <w:t xml:space="preserve"> ”Internal Users” </w:t>
       </w:r>
       <w:r>
         <w:sym w:font="Wingdings" w:char="F0E0"/>
@@ -5484,92 +5180,24 @@
       </w:r>
     </w:p>
     <w:p>
-      <w:proofErr w:type="spellStart"/>
-      <w:proofErr w:type="gramStart"/>
-      <w:r>
-        <w:t>shell:priv</w:t>
-      </w:r>
-      <w:proofErr w:type="gramEnd"/>
-      <w:r>
-        <w:t>-lvl</w:t>
-      </w:r>
-      <w:proofErr w:type="spellEnd"/>
-      <w:r>
-        <w:t>=15</w:t>
-      </w:r>
-    </w:p>
-    <w:p>
-      <w:proofErr w:type="spellStart"/>
-      <w:r>
-        <w:t>auth-</w:t>
-      </w:r>
-      <w:proofErr w:type="gramStart"/>
-      <w:r>
-        <w:t>proxy:priv</w:t>
-      </w:r>
-      <w:proofErr w:type="gramEnd"/>
-      <w:r>
-        <w:t>-lvl</w:t>
-      </w:r>
-      <w:proofErr w:type="spellEnd"/>
-      <w:r>
-        <w:t xml:space="preserve">=15 </w:t>
-      </w:r>
-    </w:p>
-    <w:p>
-      <w:r>
-        <w:t>auth-</w:t>
-      </w:r>
-      <w:proofErr w:type="gramStart"/>
-      <w:r>
-        <w:t>proxy:proxyacl</w:t>
-      </w:r>
-      <w:proofErr w:type="gramEnd"/>
-      <w:r>
-        <w:t xml:space="preserve">#1=permit </w:t>
-      </w:r>
-      <w:proofErr w:type="spellStart"/>
-      <w:r>
-        <w:t>icmp</w:t>
-      </w:r>
-      <w:proofErr w:type="spellEnd"/>
-      <w:r>
-        <w:t xml:space="preserve"> any </w:t>
-      </w:r>
-      <w:proofErr w:type="spellStart"/>
-      <w:r>
-        <w:t>any</w:t>
-      </w:r>
-      <w:proofErr w:type="spellEnd"/>
-      <w:r>
-        <w:t xml:space="preserve"> </w:t>
-      </w:r>
-    </w:p>
-    <w:p>
-      <w:r>
-        <w:t>auth-</w:t>
-      </w:r>
-      <w:proofErr w:type="gramStart"/>
-      <w:r>
-        <w:t>proxy:proxyacl</w:t>
-      </w:r>
-      <w:proofErr w:type="gramEnd"/>
-      <w:r>
-        <w:t xml:space="preserve">#2=permit </w:t>
-      </w:r>
-      <w:proofErr w:type="spellStart"/>
-      <w:r>
-        <w:t>tcp</w:t>
-      </w:r>
-      <w:proofErr w:type="spellEnd"/>
-      <w:r>
-        <w:t xml:space="preserve"> any </w:t>
-      </w:r>
-      <w:proofErr w:type="spellStart"/>
-      <w:r>
-        <w:t>any</w:t>
-      </w:r>
-      <w:proofErr w:type="spellEnd"/>
+      <w:r>
+        <w:t>shell:priv-lvl=15</w:t>
+      </w:r>
+    </w:p>
+    <w:p>
+      <w:r>
+        <w:t xml:space="preserve">auth-proxy:priv-lvl=15 </w:t>
+      </w:r>
+    </w:p>
+    <w:p>
+      <w:r>
+        <w:t xml:space="preserve">auth-proxy:proxyacl#1=permit icmp any any </w:t>
+      </w:r>
+    </w:p>
+    <w:p>
+      <w:r>
+        <w:t>auth-proxy:proxyacl#2=permit tcp any any</w:t>
+      </w:r>
     </w:p>
     <w:sectPr>
       <w:pgSz w:w="11906" w:h="16838"/>

</xml_diff>